<commit_message>
Fix coding and equalization implementation
</commit_message>
<xml_diff>
--- a/REPORT.docx
+++ b/REPORT.docx
@@ -839,6 +839,98 @@
         <w:pStyle w:val="Heading3"/>
       </w:pPr>
       <w:r>
+        <w:t>5.1 附：卷积码 BER 对比</w:t>
+      </w:r>
+    </w:p>
+    <w:p>
+      <w:pPr>
+        <w:jc w:val="center"/>
+      </w:pPr>
+      <w:r>
+        <w:drawing>
+          <wp:inline xmlns:a="http://schemas.openxmlformats.org/drawingml/2006/main" xmlns:pic="http://schemas.openxmlformats.org/drawingml/2006/picture">
+            <wp:extent cx="4572000" cy="2857500"/>
+            <wp:docPr id="2" name="Picture 2"/>
+            <wp:cNvGraphicFramePr>
+              <a:graphicFrameLocks noChangeAspect="1"/>
+            </wp:cNvGraphicFramePr>
+            <a:graphic>
+              <a:graphicData uri="http://schemas.openxmlformats.org/drawingml/2006/picture">
+                <pic:pic>
+                  <pic:nvPicPr>
+                    <pic:cNvPr id="0" name="coding_ber_curve_conv.png"/>
+                    <pic:cNvPicPr/>
+                  </pic:nvPicPr>
+                  <pic:blipFill>
+                    <a:blip r:embed="rId10"/>
+                    <a:stretch>
+                      <a:fillRect/>
+                    </a:stretch>
+                  </pic:blipFill>
+                  <pic:spPr>
+                    <a:xfrm>
+                      <a:off x="0" y="0"/>
+                      <a:ext cx="4572000" cy="2857500"/>
+                    </a:xfrm>
+                    <a:prstGeom prst="rect"/>
+                  </pic:spPr>
+                </pic:pic>
+              </a:graphicData>
+            </a:graphic>
+          </wp:inline>
+        </w:drawing>
+      </w:r>
+    </w:p>
+    <w:p>
+      <w:pPr>
+        <w:jc w:val="center"/>
+      </w:pPr>
+      <w:r>
+        <w:rPr>
+          <w:color w:val="646464"/>
+          <w:sz w:val="20"/>
+        </w:rPr>
+        <w:t>图：卷积码BER曲线</w:t>
+      </w:r>
+    </w:p>
+    <w:p>
+      <w:r>
+        <w:rPr>
+          <w:b/>
+        </w:rPr>
+        <w:t>说明</w:t>
+      </w:r>
+      <w:r>
+        <w:t xml:space="preserve">：在 Hamming(7,4) 基础上增加卷积码 (2,1,3) + Viterbi 硬判决译码的 BER 曲线（绿色）。无误传输下译码 BER = 0（验证了编码-译码的正确性）。在低误码概率下卷积码的纠错能力接近 Hamming(7,4)；卷积码码率 </w:t>
+      </w:r>
+      <w:r>
+        <w:rPr>
+          <w:rFonts w:ascii="Consolas" w:hAnsi="Consolas"/>
+          <w:i/>
+          <w:sz w:val="20"/>
+        </w:rPr>
+        <w:t>R=1/2</w:t>
+      </w:r>
+      <w:r>
+        <w:t xml:space="preserve"> 虽然更低，但约束长度仅 </w:t>
+      </w:r>
+      <w:r>
+        <w:rPr>
+          <w:rFonts w:ascii="Consolas" w:hAnsi="Consolas"/>
+          <w:i/>
+          <w:sz w:val="20"/>
+        </w:rPr>
+        <w:t>K=3</w:t>
+      </w:r>
+      <w:r>
+        <w:t xml:space="preserve"> 限制了编码增益，增大约束长度和采用软判决可进一步提升性能。</w:t>
+      </w:r>
+    </w:p>
+    <w:p>
+      <w:pPr>
+        <w:pStyle w:val="Heading3"/>
+      </w:pPr>
+      <w:r>
         <w:t>5.2 Part 2：均衡波形对比</w:t>
       </w:r>
     </w:p>
@@ -850,7 +942,7 @@
         <w:drawing>
           <wp:inline xmlns:a="http://schemas.openxmlformats.org/drawingml/2006/main" xmlns:pic="http://schemas.openxmlformats.org/drawingml/2006/picture">
             <wp:extent cx="4572000" cy="2743200"/>
-            <wp:docPr id="2" name="Picture 2"/>
+            <wp:docPr id="3" name="Picture 3"/>
             <wp:cNvGraphicFramePr>
               <a:graphicFrameLocks noChangeAspect="1"/>
             </wp:cNvGraphicFramePr>
@@ -862,7 +954,7 @@
                     <pic:cNvPicPr/>
                   </pic:nvPicPr>
                   <pic:blipFill>
-                    <a:blip r:embed="rId10"/>
+                    <a:blip r:embed="rId11"/>
                     <a:stretch>
                       <a:fillRect/>
                     </a:stretch>
@@ -942,7 +1034,7 @@
         <w:drawing>
           <wp:inline xmlns:a="http://schemas.openxmlformats.org/drawingml/2006/main" xmlns:pic="http://schemas.openxmlformats.org/drawingml/2006/picture">
             <wp:extent cx="4572000" cy="2857500"/>
-            <wp:docPr id="3" name="Picture 3"/>
+            <wp:docPr id="4" name="Picture 4"/>
             <wp:cNvGraphicFramePr>
               <a:graphicFrameLocks noChangeAspect="1"/>
             </wp:cNvGraphicFramePr>
@@ -954,7 +1046,7 @@
                     <pic:cNvPicPr/>
                   </pic:nvPicPr>
                   <pic:blipFill>
-                    <a:blip r:embed="rId11"/>
+                    <a:blip r:embed="rId12"/>
                     <a:stretch>
                       <a:fillRect/>
                     </a:stretch>

</xml_diff>